<commit_message>
Standup log 8 complete
</commit_message>
<xml_diff>
--- a/02_WorkingDocs/CMMCFledge_Standup_Log.docx
+++ b/02_WorkingDocs/CMMCFledge_Standup_Log.docx
@@ -702,7 +702,23 @@
           <w:rFonts w:ascii="Times New Roman" w:eastAsia="Times New Roman" w:hAnsi="Times New Roman" w:cs="Times New Roman"/>
           <w:b/>
         </w:rPr>
-        <w:t>1.) What progress you made since the last meeting, including specific items that were completed, and the time spent on each item</w:t>
+        <w:t xml:space="preserve">1.) What progress </w:t>
+      </w:r>
+      <w:proofErr w:type="gramStart"/>
+      <w:r>
+        <w:rPr>
+          <w:rFonts w:ascii="Times New Roman" w:eastAsia="Times New Roman" w:hAnsi="Times New Roman" w:cs="Times New Roman"/>
+          <w:b/>
+        </w:rPr>
+        <w:t>you</w:t>
+      </w:r>
+      <w:proofErr w:type="gramEnd"/>
+      <w:r>
+        <w:rPr>
+          <w:rFonts w:ascii="Times New Roman" w:eastAsia="Times New Roman" w:hAnsi="Times New Roman" w:cs="Times New Roman"/>
+          <w:b/>
+        </w:rPr>
+        <w:t xml:space="preserve"> made since the last meeting, including specific items that were completed, and the time spent on each item</w:t>
       </w:r>
     </w:p>
     <w:p>
@@ -782,7 +798,21 @@
         <w:rPr>
           <w:rFonts w:ascii="Times New Roman" w:eastAsia="Times New Roman" w:hAnsi="Times New Roman" w:cs="Times New Roman"/>
         </w:rPr>
-        <w:t>Note: As of this writing, the initial proposal has not returned from review. The CMMC Fledge project will begin this week.</w:t>
+        <w:t xml:space="preserve">Note: As of this writing, the initial proposal has not </w:t>
+      </w:r>
+      <w:proofErr w:type="gramStart"/>
+      <w:r>
+        <w:rPr>
+          <w:rFonts w:ascii="Times New Roman" w:eastAsia="Times New Roman" w:hAnsi="Times New Roman" w:cs="Times New Roman"/>
+        </w:rPr>
+        <w:t>returned</w:t>
+      </w:r>
+      <w:proofErr w:type="gramEnd"/>
+      <w:r>
+        <w:rPr>
+          <w:rFonts w:ascii="Times New Roman" w:eastAsia="Times New Roman" w:hAnsi="Times New Roman" w:cs="Times New Roman"/>
+        </w:rPr>
+        <w:t xml:space="preserve"> from review. The CMMC Fledge project will begin this week.</w:t>
       </w:r>
     </w:p>
     <w:p>
@@ -882,7 +912,21 @@
         <w:rPr>
           <w:rFonts w:ascii="Times New Roman" w:eastAsia="Times New Roman" w:hAnsi="Times New Roman" w:cs="Times New Roman"/>
         </w:rPr>
-        <w:t>Create Time Log (2 hour)</w:t>
+        <w:t xml:space="preserve">Create Time Log (2 </w:t>
+      </w:r>
+      <w:proofErr w:type="gramStart"/>
+      <w:r>
+        <w:rPr>
+          <w:rFonts w:ascii="Times New Roman" w:eastAsia="Times New Roman" w:hAnsi="Times New Roman" w:cs="Times New Roman"/>
+        </w:rPr>
+        <w:t>hour</w:t>
+      </w:r>
+      <w:proofErr w:type="gramEnd"/>
+      <w:r>
+        <w:rPr>
+          <w:rFonts w:ascii="Times New Roman" w:eastAsia="Times New Roman" w:hAnsi="Times New Roman" w:cs="Times New Roman"/>
+        </w:rPr>
+        <w:t>)</w:t>
       </w:r>
     </w:p>
     <w:p>
@@ -1018,7 +1062,39 @@
           <w:rFonts w:ascii="Times New Roman" w:eastAsia="Times New Roman" w:hAnsi="Times New Roman" w:cs="Times New Roman"/>
           <w:b/>
         </w:rPr>
-        <w:t>3.) Any changes you have identified that will result in your final project being different than your project proposal. This information must be recorded in 3 ways</w:t>
+        <w:t xml:space="preserve">3.) Any changes you have </w:t>
+      </w:r>
+      <w:proofErr w:type="gramStart"/>
+      <w:r>
+        <w:rPr>
+          <w:rFonts w:ascii="Times New Roman" w:eastAsia="Times New Roman" w:hAnsi="Times New Roman" w:cs="Times New Roman"/>
+          <w:b/>
+        </w:rPr>
+        <w:t>identified that</w:t>
+      </w:r>
+      <w:proofErr w:type="gramEnd"/>
+      <w:r>
+        <w:rPr>
+          <w:rFonts w:ascii="Times New Roman" w:eastAsia="Times New Roman" w:hAnsi="Times New Roman" w:cs="Times New Roman"/>
+          <w:b/>
+        </w:rPr>
+        <w:t xml:space="preserve"> will result in your final project being different </w:t>
+      </w:r>
+      <w:proofErr w:type="gramStart"/>
+      <w:r>
+        <w:rPr>
+          <w:rFonts w:ascii="Times New Roman" w:eastAsia="Times New Roman" w:hAnsi="Times New Roman" w:cs="Times New Roman"/>
+          <w:b/>
+        </w:rPr>
+        <w:t>than</w:t>
+      </w:r>
+      <w:proofErr w:type="gramEnd"/>
+      <w:r>
+        <w:rPr>
+          <w:rFonts w:ascii="Times New Roman" w:eastAsia="Times New Roman" w:hAnsi="Times New Roman" w:cs="Times New Roman"/>
+          <w:b/>
+        </w:rPr>
+        <w:t xml:space="preserve"> your project proposal. This information must be recorded in 3 ways</w:t>
       </w:r>
     </w:p>
     <w:p>
@@ -1077,7 +1153,23 @@
           <w:rFonts w:ascii="Times New Roman" w:eastAsia="Times New Roman" w:hAnsi="Times New Roman" w:cs="Times New Roman"/>
           <w:b/>
         </w:rPr>
-        <w:t>1.) What progress you made since the last meeting, including specific items that were completed, and the time spent on each item</w:t>
+        <w:t xml:space="preserve">1.) What progress </w:t>
+      </w:r>
+      <w:proofErr w:type="gramStart"/>
+      <w:r>
+        <w:rPr>
+          <w:rFonts w:ascii="Times New Roman" w:eastAsia="Times New Roman" w:hAnsi="Times New Roman" w:cs="Times New Roman"/>
+          <w:b/>
+        </w:rPr>
+        <w:t>you</w:t>
+      </w:r>
+      <w:proofErr w:type="gramEnd"/>
+      <w:r>
+        <w:rPr>
+          <w:rFonts w:ascii="Times New Roman" w:eastAsia="Times New Roman" w:hAnsi="Times New Roman" w:cs="Times New Roman"/>
+          <w:b/>
+        </w:rPr>
+        <w:t xml:space="preserve"> made since the last meeting, including specific items that were completed, and the time spent on each item</w:t>
       </w:r>
     </w:p>
     <w:p>
@@ -1448,7 +1540,39 @@
           <w:rFonts w:ascii="Times New Roman" w:eastAsia="Times New Roman" w:hAnsi="Times New Roman" w:cs="Times New Roman"/>
           <w:b/>
         </w:rPr>
-        <w:t>3.) Any changes you have identified that will result in your final project being different than your project proposal. This information must be recorded in 3 ways</w:t>
+        <w:t xml:space="preserve">3.) Any changes you have </w:t>
+      </w:r>
+      <w:proofErr w:type="gramStart"/>
+      <w:r>
+        <w:rPr>
+          <w:rFonts w:ascii="Times New Roman" w:eastAsia="Times New Roman" w:hAnsi="Times New Roman" w:cs="Times New Roman"/>
+          <w:b/>
+        </w:rPr>
+        <w:t>identified that</w:t>
+      </w:r>
+      <w:proofErr w:type="gramEnd"/>
+      <w:r>
+        <w:rPr>
+          <w:rFonts w:ascii="Times New Roman" w:eastAsia="Times New Roman" w:hAnsi="Times New Roman" w:cs="Times New Roman"/>
+          <w:b/>
+        </w:rPr>
+        <w:t xml:space="preserve"> will result in your final project being different </w:t>
+      </w:r>
+      <w:proofErr w:type="gramStart"/>
+      <w:r>
+        <w:rPr>
+          <w:rFonts w:ascii="Times New Roman" w:eastAsia="Times New Roman" w:hAnsi="Times New Roman" w:cs="Times New Roman"/>
+          <w:b/>
+        </w:rPr>
+        <w:t>than</w:t>
+      </w:r>
+      <w:proofErr w:type="gramEnd"/>
+      <w:r>
+        <w:rPr>
+          <w:rFonts w:ascii="Times New Roman" w:eastAsia="Times New Roman" w:hAnsi="Times New Roman" w:cs="Times New Roman"/>
+          <w:b/>
+        </w:rPr>
+        <w:t xml:space="preserve"> your project proposal. This information must be recorded in 3 ways</w:t>
       </w:r>
     </w:p>
     <w:p>
@@ -1510,7 +1634,23 @@
           <w:rFonts w:ascii="Times New Roman" w:eastAsia="Times New Roman" w:hAnsi="Times New Roman" w:cs="Times New Roman"/>
           <w:b/>
         </w:rPr>
-        <w:t>1.) What progress you made since the last meeting, including specific items that were completed, and the time spent on each item</w:t>
+        <w:t xml:space="preserve">1.) What progress </w:t>
+      </w:r>
+      <w:proofErr w:type="gramStart"/>
+      <w:r>
+        <w:rPr>
+          <w:rFonts w:ascii="Times New Roman" w:eastAsia="Times New Roman" w:hAnsi="Times New Roman" w:cs="Times New Roman"/>
+          <w:b/>
+        </w:rPr>
+        <w:t>you</w:t>
+      </w:r>
+      <w:proofErr w:type="gramEnd"/>
+      <w:r>
+        <w:rPr>
+          <w:rFonts w:ascii="Times New Roman" w:eastAsia="Times New Roman" w:hAnsi="Times New Roman" w:cs="Times New Roman"/>
+          <w:b/>
+        </w:rPr>
+        <w:t xml:space="preserve"> made since the last meeting, including specific items that were completed, and the time spent on each item</w:t>
       </w:r>
     </w:p>
     <w:p>
@@ -1881,31 +2021,77 @@
           <w:rFonts w:ascii="Times New Roman" w:eastAsia="Times New Roman" w:hAnsi="Times New Roman" w:cs="Times New Roman"/>
           <w:b/>
         </w:rPr>
-        <w:t>3.) Any changes you have identified that will result in your final project being different than your project proposal. This information must be recorded in 3 ways</w:t>
-      </w:r>
-    </w:p>
-    <w:p>
-      <w:pPr>
-        <w:shd w:val="clear" w:color="auto" w:fill="FFFFFF"/>
-        <w:rPr>
-          <w:rFonts w:ascii="Times New Roman" w:eastAsia="Times New Roman" w:hAnsi="Times New Roman" w:cs="Times New Roman"/>
-          <w:b/>
-        </w:rPr>
-      </w:pPr>
-    </w:p>
-    <w:p>
-      <w:pPr>
-        <w:shd w:val="clear" w:color="auto" w:fill="FFFFFF"/>
-        <w:rPr>
-          <w:rFonts w:ascii="Times New Roman" w:eastAsia="Times New Roman" w:hAnsi="Times New Roman" w:cs="Times New Roman"/>
-          <w:b/>
-        </w:rPr>
-      </w:pPr>
-      <w:r>
-        <w:rPr>
-          <w:rFonts w:ascii="Times New Roman" w:eastAsia="Times New Roman" w:hAnsi="Times New Roman" w:cs="Times New Roman"/>
-        </w:rPr>
-        <w:t>Changes have been made to the CMMC Fledge System. Project scope has been streamlined to remove CMMC l3 certification. Though not specified in the original project proposal, CMMC contains three levels of certification. The most common is CMMC l2 containing 110 controls. CMMC l3 builds off of those 110 controls and adds 24 additional controls. Due to the time constraints and complexity of the controls added, the CMMC Fledge system will not be pursuing assistance with the additional requirements of CMMC l3. CMMC l1 and CMMC l2 will remain in scope. Minor time adjustments have been made to the proposal. Milestones and tasks remain the same. These changes have been implemented in the proposal (CMMCFledge_Proposal_V1.0.3.docx), October 7, 2025.</w:t>
+        <w:t xml:space="preserve">3.) Any changes you have </w:t>
+      </w:r>
+      <w:proofErr w:type="gramStart"/>
+      <w:r>
+        <w:rPr>
+          <w:rFonts w:ascii="Times New Roman" w:eastAsia="Times New Roman" w:hAnsi="Times New Roman" w:cs="Times New Roman"/>
+          <w:b/>
+        </w:rPr>
+        <w:t>identified that</w:t>
+      </w:r>
+      <w:proofErr w:type="gramEnd"/>
+      <w:r>
+        <w:rPr>
+          <w:rFonts w:ascii="Times New Roman" w:eastAsia="Times New Roman" w:hAnsi="Times New Roman" w:cs="Times New Roman"/>
+          <w:b/>
+        </w:rPr>
+        <w:t xml:space="preserve"> will result in your final project being different </w:t>
+      </w:r>
+      <w:proofErr w:type="gramStart"/>
+      <w:r>
+        <w:rPr>
+          <w:rFonts w:ascii="Times New Roman" w:eastAsia="Times New Roman" w:hAnsi="Times New Roman" w:cs="Times New Roman"/>
+          <w:b/>
+        </w:rPr>
+        <w:t>than</w:t>
+      </w:r>
+      <w:proofErr w:type="gramEnd"/>
+      <w:r>
+        <w:rPr>
+          <w:rFonts w:ascii="Times New Roman" w:eastAsia="Times New Roman" w:hAnsi="Times New Roman" w:cs="Times New Roman"/>
+          <w:b/>
+        </w:rPr>
+        <w:t xml:space="preserve"> your project proposal. This information must be recorded in 3 ways</w:t>
+      </w:r>
+    </w:p>
+    <w:p>
+      <w:pPr>
+        <w:shd w:val="clear" w:color="auto" w:fill="FFFFFF"/>
+        <w:rPr>
+          <w:rFonts w:ascii="Times New Roman" w:eastAsia="Times New Roman" w:hAnsi="Times New Roman" w:cs="Times New Roman"/>
+          <w:b/>
+        </w:rPr>
+      </w:pPr>
+    </w:p>
+    <w:p>
+      <w:pPr>
+        <w:shd w:val="clear" w:color="auto" w:fill="FFFFFF"/>
+        <w:rPr>
+          <w:rFonts w:ascii="Times New Roman" w:eastAsia="Times New Roman" w:hAnsi="Times New Roman" w:cs="Times New Roman"/>
+          <w:b/>
+        </w:rPr>
+      </w:pPr>
+      <w:r>
+        <w:rPr>
+          <w:rFonts w:ascii="Times New Roman" w:eastAsia="Times New Roman" w:hAnsi="Times New Roman" w:cs="Times New Roman"/>
+        </w:rPr>
+        <w:t xml:space="preserve">Changes have been made to the CMMC Fledge System. Project scope has been streamlined to remove CMMC l3 certification. Though not specified in the original project proposal, CMMC contains three levels of certification. The most common is CMMC l2 containing 110 controls. CMMC l3 builds </w:t>
+      </w:r>
+      <w:proofErr w:type="gramStart"/>
+      <w:r>
+        <w:rPr>
+          <w:rFonts w:ascii="Times New Roman" w:eastAsia="Times New Roman" w:hAnsi="Times New Roman" w:cs="Times New Roman"/>
+        </w:rPr>
+        <w:t>off of</w:t>
+      </w:r>
+      <w:proofErr w:type="gramEnd"/>
+      <w:r>
+        <w:rPr>
+          <w:rFonts w:ascii="Times New Roman" w:eastAsia="Times New Roman" w:hAnsi="Times New Roman" w:cs="Times New Roman"/>
+        </w:rPr>
+        <w:t xml:space="preserve"> those 110 controls and adds 24 additional controls. Due to the time constraints and complexity of the controls added, the CMMC Fledge system will not be pursuing assistance with the additional requirements of CMMC l3. CMMC l1 and CMMC l2 will remain in scope. Minor time adjustments have been made to the proposal. Milestones and tasks remain the same. These changes have been implemented in the proposal (CMMCFledge_Proposal_V1.0.3.docx), October 7, 2025.</w:t>
       </w:r>
       <w:r>
         <w:rPr>
@@ -1945,7 +2131,23 @@
           <w:rFonts w:ascii="Times New Roman" w:eastAsia="Times New Roman" w:hAnsi="Times New Roman" w:cs="Times New Roman"/>
           <w:b/>
         </w:rPr>
-        <w:t>1.) What progress you made since the last meeting, including specific items that were completed, and the time spent on each item</w:t>
+        <w:t xml:space="preserve">1.) What progress </w:t>
+      </w:r>
+      <w:proofErr w:type="gramStart"/>
+      <w:r>
+        <w:rPr>
+          <w:rFonts w:ascii="Times New Roman" w:eastAsia="Times New Roman" w:hAnsi="Times New Roman" w:cs="Times New Roman"/>
+          <w:b/>
+        </w:rPr>
+        <w:t>you</w:t>
+      </w:r>
+      <w:proofErr w:type="gramEnd"/>
+      <w:r>
+        <w:rPr>
+          <w:rFonts w:ascii="Times New Roman" w:eastAsia="Times New Roman" w:hAnsi="Times New Roman" w:cs="Times New Roman"/>
+          <w:b/>
+        </w:rPr>
+        <w:t xml:space="preserve"> made since the last meeting, including specific items that were completed, and the time spent on each item</w:t>
       </w:r>
     </w:p>
     <w:p>
@@ -2176,7 +2378,21 @@
         <w:rPr>
           <w:rFonts w:ascii="Times New Roman" w:eastAsia="Times New Roman" w:hAnsi="Times New Roman" w:cs="Times New Roman"/>
         </w:rPr>
-        <w:t xml:space="preserve">In line with expected progress. Additional work of the Milestone Report and the GitHub Repo was added to the milestone requirements after the Week 3 Standup. These additions have not/will not </w:t>
+        <w:t xml:space="preserve">In line with expected progress. Additional work of the Milestone Report and the GitHub Repo was added to the milestone requirements after </w:t>
+      </w:r>
+      <w:proofErr w:type="gramStart"/>
+      <w:r>
+        <w:rPr>
+          <w:rFonts w:ascii="Times New Roman" w:eastAsia="Times New Roman" w:hAnsi="Times New Roman" w:cs="Times New Roman"/>
+        </w:rPr>
+        <w:t>the Week</w:t>
+      </w:r>
+      <w:proofErr w:type="gramEnd"/>
+      <w:r>
+        <w:rPr>
+          <w:rFonts w:ascii="Times New Roman" w:eastAsia="Times New Roman" w:hAnsi="Times New Roman" w:cs="Times New Roman"/>
+        </w:rPr>
+        <w:t xml:space="preserve"> 3 Standup. These additions have not/will not </w:t>
       </w:r>
       <w:r>
         <w:rPr>
@@ -2467,7 +2683,39 @@
           <w:rFonts w:ascii="Times New Roman" w:eastAsia="Times New Roman" w:hAnsi="Times New Roman" w:cs="Times New Roman"/>
           <w:b/>
         </w:rPr>
-        <w:t>3.) Any changes you have identified that will result in your final project being different than your project proposal. This information must be recorded in 3 ways</w:t>
+        <w:t xml:space="preserve">3.) Any changes you have </w:t>
+      </w:r>
+      <w:proofErr w:type="gramStart"/>
+      <w:r>
+        <w:rPr>
+          <w:rFonts w:ascii="Times New Roman" w:eastAsia="Times New Roman" w:hAnsi="Times New Roman" w:cs="Times New Roman"/>
+          <w:b/>
+        </w:rPr>
+        <w:t>identified that</w:t>
+      </w:r>
+      <w:proofErr w:type="gramEnd"/>
+      <w:r>
+        <w:rPr>
+          <w:rFonts w:ascii="Times New Roman" w:eastAsia="Times New Roman" w:hAnsi="Times New Roman" w:cs="Times New Roman"/>
+          <w:b/>
+        </w:rPr>
+        <w:t xml:space="preserve"> will result in your final project being different </w:t>
+      </w:r>
+      <w:proofErr w:type="gramStart"/>
+      <w:r>
+        <w:rPr>
+          <w:rFonts w:ascii="Times New Roman" w:eastAsia="Times New Roman" w:hAnsi="Times New Roman" w:cs="Times New Roman"/>
+          <w:b/>
+        </w:rPr>
+        <w:t>than</w:t>
+      </w:r>
+      <w:proofErr w:type="gramEnd"/>
+      <w:r>
+        <w:rPr>
+          <w:rFonts w:ascii="Times New Roman" w:eastAsia="Times New Roman" w:hAnsi="Times New Roman" w:cs="Times New Roman"/>
+          <w:b/>
+        </w:rPr>
+        <w:t xml:space="preserve"> your project proposal. This information must be recorded in 3 ways</w:t>
       </w:r>
     </w:p>
     <w:p>
@@ -2566,7 +2814,23 @@
           <w:rFonts w:ascii="Times New Roman" w:eastAsia="Times New Roman" w:hAnsi="Times New Roman" w:cs="Times New Roman"/>
           <w:b/>
         </w:rPr>
-        <w:t>1.) What progress you made since the last meeting, including specific items that were completed, and the time spent on each item</w:t>
+        <w:t xml:space="preserve">1.) What progress </w:t>
+      </w:r>
+      <w:proofErr w:type="gramStart"/>
+      <w:r>
+        <w:rPr>
+          <w:rFonts w:ascii="Times New Roman" w:eastAsia="Times New Roman" w:hAnsi="Times New Roman" w:cs="Times New Roman"/>
+          <w:b/>
+        </w:rPr>
+        <w:t>you</w:t>
+      </w:r>
+      <w:proofErr w:type="gramEnd"/>
+      <w:r>
+        <w:rPr>
+          <w:rFonts w:ascii="Times New Roman" w:eastAsia="Times New Roman" w:hAnsi="Times New Roman" w:cs="Times New Roman"/>
+          <w:b/>
+        </w:rPr>
+        <w:t xml:space="preserve"> made since the last meeting, including specific items that were completed, and the time spent on each item</w:t>
       </w:r>
     </w:p>
     <w:p>
@@ -2939,7 +3203,39 @@
           <w:rFonts w:ascii="Times New Roman" w:eastAsia="Times New Roman" w:hAnsi="Times New Roman" w:cs="Times New Roman"/>
           <w:b/>
         </w:rPr>
-        <w:t>3.) Any changes you have identified that will result in your final project being different than your project proposal. This information must be recorded in 3 ways</w:t>
+        <w:t xml:space="preserve">3.) Any changes you have </w:t>
+      </w:r>
+      <w:proofErr w:type="gramStart"/>
+      <w:r>
+        <w:rPr>
+          <w:rFonts w:ascii="Times New Roman" w:eastAsia="Times New Roman" w:hAnsi="Times New Roman" w:cs="Times New Roman"/>
+          <w:b/>
+        </w:rPr>
+        <w:t>identified that</w:t>
+      </w:r>
+      <w:proofErr w:type="gramEnd"/>
+      <w:r>
+        <w:rPr>
+          <w:rFonts w:ascii="Times New Roman" w:eastAsia="Times New Roman" w:hAnsi="Times New Roman" w:cs="Times New Roman"/>
+          <w:b/>
+        </w:rPr>
+        <w:t xml:space="preserve"> will result in your final project being different </w:t>
+      </w:r>
+      <w:proofErr w:type="gramStart"/>
+      <w:r>
+        <w:rPr>
+          <w:rFonts w:ascii="Times New Roman" w:eastAsia="Times New Roman" w:hAnsi="Times New Roman" w:cs="Times New Roman"/>
+          <w:b/>
+        </w:rPr>
+        <w:t>than</w:t>
+      </w:r>
+      <w:proofErr w:type="gramEnd"/>
+      <w:r>
+        <w:rPr>
+          <w:rFonts w:ascii="Times New Roman" w:eastAsia="Times New Roman" w:hAnsi="Times New Roman" w:cs="Times New Roman"/>
+          <w:b/>
+        </w:rPr>
+        <w:t xml:space="preserve"> your project proposal. This information must be recorded in 3 ways</w:t>
       </w:r>
     </w:p>
     <w:p>
@@ -3025,7 +3321,23 @@
           <w:rFonts w:ascii="Times New Roman" w:eastAsia="Times New Roman" w:hAnsi="Times New Roman" w:cs="Times New Roman"/>
           <w:b/>
         </w:rPr>
-        <w:t>1.) What progress you made since the last meeting, including specific items that were completed, and the time spent on each item</w:t>
+        <w:t xml:space="preserve">1.) What progress </w:t>
+      </w:r>
+      <w:proofErr w:type="gramStart"/>
+      <w:r>
+        <w:rPr>
+          <w:rFonts w:ascii="Times New Roman" w:eastAsia="Times New Roman" w:hAnsi="Times New Roman" w:cs="Times New Roman"/>
+          <w:b/>
+        </w:rPr>
+        <w:t>you</w:t>
+      </w:r>
+      <w:proofErr w:type="gramEnd"/>
+      <w:r>
+        <w:rPr>
+          <w:rFonts w:ascii="Times New Roman" w:eastAsia="Times New Roman" w:hAnsi="Times New Roman" w:cs="Times New Roman"/>
+          <w:b/>
+        </w:rPr>
+        <w:t xml:space="preserve"> made since the last meeting, including specific items that were completed, and the time spent on each item</w:t>
       </w:r>
     </w:p>
     <w:p>
@@ -3453,7 +3765,39 @@
           <w:rFonts w:ascii="Times New Roman" w:eastAsia="Times New Roman" w:hAnsi="Times New Roman" w:cs="Times New Roman"/>
           <w:b/>
         </w:rPr>
-        <w:t>3.) Any changes you have identified that will result in your final project being different than your project proposal. This information must be recorded in 3 ways</w:t>
+        <w:t xml:space="preserve">3.) Any changes you have </w:t>
+      </w:r>
+      <w:proofErr w:type="gramStart"/>
+      <w:r>
+        <w:rPr>
+          <w:rFonts w:ascii="Times New Roman" w:eastAsia="Times New Roman" w:hAnsi="Times New Roman" w:cs="Times New Roman"/>
+          <w:b/>
+        </w:rPr>
+        <w:t>identified that</w:t>
+      </w:r>
+      <w:proofErr w:type="gramEnd"/>
+      <w:r>
+        <w:rPr>
+          <w:rFonts w:ascii="Times New Roman" w:eastAsia="Times New Roman" w:hAnsi="Times New Roman" w:cs="Times New Roman"/>
+          <w:b/>
+        </w:rPr>
+        <w:t xml:space="preserve"> will result in your final project being different </w:t>
+      </w:r>
+      <w:proofErr w:type="gramStart"/>
+      <w:r>
+        <w:rPr>
+          <w:rFonts w:ascii="Times New Roman" w:eastAsia="Times New Roman" w:hAnsi="Times New Roman" w:cs="Times New Roman"/>
+          <w:b/>
+        </w:rPr>
+        <w:t>than</w:t>
+      </w:r>
+      <w:proofErr w:type="gramEnd"/>
+      <w:r>
+        <w:rPr>
+          <w:rFonts w:ascii="Times New Roman" w:eastAsia="Times New Roman" w:hAnsi="Times New Roman" w:cs="Times New Roman"/>
+          <w:b/>
+        </w:rPr>
+        <w:t xml:space="preserve"> your project proposal. This information must be recorded in 3 ways</w:t>
       </w:r>
     </w:p>
     <w:p/>
@@ -3505,7 +3849,13 @@
       <w:bookmarkStart w:id="10" w:name="_Toc211503550"/>
       <w:r>
         <w:lastRenderedPageBreak/>
-        <w:t>Week 7 (11/2/2025)</w:t>
+        <w:t>Week 7 (11/</w:t>
+      </w:r>
+      <w:r>
+        <w:t>9</w:t>
+      </w:r>
+      <w:r>
+        <w:t>/2025)</w:t>
       </w:r>
       <w:bookmarkEnd w:id="10"/>
     </w:p>
@@ -3522,7 +3872,23 @@
           <w:rFonts w:ascii="Times New Roman" w:eastAsia="Times New Roman" w:hAnsi="Times New Roman" w:cs="Times New Roman"/>
           <w:b/>
         </w:rPr>
-        <w:t>1.) What progress you made since the last meeting, including specific items that were completed, and the time spent on each item</w:t>
+        <w:t xml:space="preserve">1.) What progress </w:t>
+      </w:r>
+      <w:proofErr w:type="gramStart"/>
+      <w:r>
+        <w:rPr>
+          <w:rFonts w:ascii="Times New Roman" w:eastAsia="Times New Roman" w:hAnsi="Times New Roman" w:cs="Times New Roman"/>
+          <w:b/>
+        </w:rPr>
+        <w:t>you</w:t>
+      </w:r>
+      <w:proofErr w:type="gramEnd"/>
+      <w:r>
+        <w:rPr>
+          <w:rFonts w:ascii="Times New Roman" w:eastAsia="Times New Roman" w:hAnsi="Times New Roman" w:cs="Times New Roman"/>
+          <w:b/>
+        </w:rPr>
+        <w:t xml:space="preserve"> made since the last meeting, including specific items that were completed, and the time spent on each item</w:t>
       </w:r>
     </w:p>
     <w:p>
@@ -4066,7 +4432,39 @@
           <w:rFonts w:ascii="Times New Roman" w:eastAsia="Times New Roman" w:hAnsi="Times New Roman" w:cs="Times New Roman"/>
           <w:b/>
         </w:rPr>
-        <w:t>3.) Any changes you have identified that will result in your final project being different than your project proposal. This information must be recorded in 3 ways</w:t>
+        <w:t xml:space="preserve">3.) Any changes you have </w:t>
+      </w:r>
+      <w:proofErr w:type="gramStart"/>
+      <w:r>
+        <w:rPr>
+          <w:rFonts w:ascii="Times New Roman" w:eastAsia="Times New Roman" w:hAnsi="Times New Roman" w:cs="Times New Roman"/>
+          <w:b/>
+        </w:rPr>
+        <w:t>identified that</w:t>
+      </w:r>
+      <w:proofErr w:type="gramEnd"/>
+      <w:r>
+        <w:rPr>
+          <w:rFonts w:ascii="Times New Roman" w:eastAsia="Times New Roman" w:hAnsi="Times New Roman" w:cs="Times New Roman"/>
+          <w:b/>
+        </w:rPr>
+        <w:t xml:space="preserve"> will result in your final project being different </w:t>
+      </w:r>
+      <w:proofErr w:type="gramStart"/>
+      <w:r>
+        <w:rPr>
+          <w:rFonts w:ascii="Times New Roman" w:eastAsia="Times New Roman" w:hAnsi="Times New Roman" w:cs="Times New Roman"/>
+          <w:b/>
+        </w:rPr>
+        <w:t>than</w:t>
+      </w:r>
+      <w:proofErr w:type="gramEnd"/>
+      <w:r>
+        <w:rPr>
+          <w:rFonts w:ascii="Times New Roman" w:eastAsia="Times New Roman" w:hAnsi="Times New Roman" w:cs="Times New Roman"/>
+          <w:b/>
+        </w:rPr>
+        <w:t xml:space="preserve"> your project proposal. This information must be recorded in 3 ways</w:t>
       </w:r>
     </w:p>
     <w:p>
@@ -4124,7 +4522,13 @@
       <w:bookmarkStart w:id="11" w:name="_Toc211503551"/>
       <w:r>
         <w:lastRenderedPageBreak/>
-        <w:t>Week 8 (11/9/2025)</w:t>
+        <w:t>Week 8 (11/</w:t>
+      </w:r>
+      <w:r>
+        <w:t>18</w:t>
+      </w:r>
+      <w:r>
+        <w:t>/2025)</w:t>
       </w:r>
       <w:bookmarkEnd w:id="11"/>
     </w:p>
@@ -4141,7 +4545,23 @@
           <w:rFonts w:ascii="Times New Roman" w:eastAsia="Times New Roman" w:hAnsi="Times New Roman" w:cs="Times New Roman"/>
           <w:b/>
         </w:rPr>
-        <w:t>1.) What progress you made since the last meeting, including specific items that were completed, and the time spent on each item</w:t>
+        <w:t xml:space="preserve">1.) What progress </w:t>
+      </w:r>
+      <w:proofErr w:type="gramStart"/>
+      <w:r>
+        <w:rPr>
+          <w:rFonts w:ascii="Times New Roman" w:eastAsia="Times New Roman" w:hAnsi="Times New Roman" w:cs="Times New Roman"/>
+          <w:b/>
+        </w:rPr>
+        <w:t>you</w:t>
+      </w:r>
+      <w:proofErr w:type="gramEnd"/>
+      <w:r>
+        <w:rPr>
+          <w:rFonts w:ascii="Times New Roman" w:eastAsia="Times New Roman" w:hAnsi="Times New Roman" w:cs="Times New Roman"/>
+          <w:b/>
+        </w:rPr>
+        <w:t xml:space="preserve"> made since the last meeting, including specific items that were completed, and the time spent on each item</w:t>
       </w:r>
     </w:p>
     <w:p>
@@ -4177,14 +4597,154 @@
           <w:rFonts w:ascii="Times New Roman" w:eastAsia="Times New Roman" w:hAnsi="Times New Roman" w:cs="Times New Roman"/>
         </w:rPr>
       </w:pPr>
-    </w:p>
-    <w:p>
-      <w:pPr>
-        <w:shd w:val="clear" w:color="auto" w:fill="FFFFFF"/>
-        <w:rPr>
-          <w:rFonts w:ascii="Times New Roman" w:eastAsia="Times New Roman" w:hAnsi="Times New Roman" w:cs="Times New Roman"/>
-        </w:rPr>
-      </w:pPr>
+      <w:r>
+        <w:rPr>
+          <w:rFonts w:ascii="Times New Roman" w:eastAsia="Times New Roman" w:hAnsi="Times New Roman" w:cs="Times New Roman"/>
+        </w:rPr>
+        <w:t>Domain registered/HTTPS configured (</w:t>
+      </w:r>
+      <w:r>
+        <w:rPr>
+          <w:rFonts w:ascii="Times New Roman" w:eastAsia="Times New Roman" w:hAnsi="Times New Roman" w:cs="Times New Roman"/>
+        </w:rPr>
+        <w:t>2 hours)</w:t>
+      </w:r>
+    </w:p>
+    <w:p>
+      <w:pPr>
+        <w:numPr>
+          <w:ilvl w:val="0"/>
+          <w:numId w:val="2"/>
+        </w:numPr>
+        <w:shd w:val="clear" w:color="auto" w:fill="FFFFFF"/>
+        <w:rPr>
+          <w:rFonts w:ascii="Times New Roman" w:eastAsia="Times New Roman" w:hAnsi="Times New Roman" w:cs="Times New Roman"/>
+        </w:rPr>
+      </w:pPr>
+      <w:r>
+        <w:rPr>
+          <w:rFonts w:ascii="Times New Roman" w:eastAsia="Times New Roman" w:hAnsi="Times New Roman" w:cs="Times New Roman"/>
+        </w:rPr>
+        <w:t>Redesigned</w:t>
+      </w:r>
+      <w:r>
+        <w:rPr>
+          <w:rFonts w:ascii="Times New Roman" w:eastAsia="Times New Roman" w:hAnsi="Times New Roman" w:cs="Times New Roman"/>
+        </w:rPr>
+        <w:t xml:space="preserve"> website colors</w:t>
+      </w:r>
+      <w:r>
+        <w:rPr>
+          <w:rFonts w:ascii="Times New Roman" w:eastAsia="Times New Roman" w:hAnsi="Times New Roman" w:cs="Times New Roman"/>
+        </w:rPr>
+        <w:t xml:space="preserve"> (2.5 hours)</w:t>
+      </w:r>
+    </w:p>
+    <w:p>
+      <w:pPr>
+        <w:numPr>
+          <w:ilvl w:val="0"/>
+          <w:numId w:val="2"/>
+        </w:numPr>
+        <w:shd w:val="clear" w:color="auto" w:fill="FFFFFF"/>
+        <w:rPr>
+          <w:rFonts w:ascii="Times New Roman" w:eastAsia="Times New Roman" w:hAnsi="Times New Roman" w:cs="Times New Roman"/>
+        </w:rPr>
+      </w:pPr>
+      <w:r>
+        <w:rPr>
+          <w:rFonts w:ascii="Times New Roman" w:eastAsia="Times New Roman" w:hAnsi="Times New Roman" w:cs="Times New Roman"/>
+        </w:rPr>
+        <w:t xml:space="preserve">Fledge Dictionary </w:t>
+      </w:r>
+      <w:r>
+        <w:rPr>
+          <w:rFonts w:ascii="Times New Roman" w:eastAsia="Times New Roman" w:hAnsi="Times New Roman" w:cs="Times New Roman"/>
+        </w:rPr>
+        <w:t xml:space="preserve">/About Us </w:t>
+      </w:r>
+      <w:r>
+        <w:rPr>
+          <w:rFonts w:ascii="Times New Roman" w:eastAsia="Times New Roman" w:hAnsi="Times New Roman" w:cs="Times New Roman"/>
+        </w:rPr>
+        <w:t>Page designed/created (</w:t>
+      </w:r>
+      <w:r>
+        <w:rPr>
+          <w:rFonts w:ascii="Times New Roman" w:eastAsia="Times New Roman" w:hAnsi="Times New Roman" w:cs="Times New Roman"/>
+        </w:rPr>
+        <w:t>5</w:t>
+      </w:r>
+      <w:r>
+        <w:rPr>
+          <w:rFonts w:ascii="Times New Roman" w:eastAsia="Times New Roman" w:hAnsi="Times New Roman" w:cs="Times New Roman"/>
+        </w:rPr>
+        <w:t xml:space="preserve"> hours)</w:t>
+      </w:r>
+    </w:p>
+    <w:p>
+      <w:pPr>
+        <w:numPr>
+          <w:ilvl w:val="0"/>
+          <w:numId w:val="2"/>
+        </w:numPr>
+        <w:shd w:val="clear" w:color="auto" w:fill="FFFFFF"/>
+        <w:rPr>
+          <w:rFonts w:ascii="Times New Roman" w:eastAsia="Times New Roman" w:hAnsi="Times New Roman" w:cs="Times New Roman"/>
+        </w:rPr>
+      </w:pPr>
+      <w:r>
+        <w:rPr>
+          <w:rFonts w:ascii="Times New Roman" w:eastAsia="Times New Roman" w:hAnsi="Times New Roman" w:cs="Times New Roman"/>
+        </w:rPr>
+        <w:t>Adding CMMC L2 controls to DB (3.5 hours)</w:t>
+      </w:r>
+    </w:p>
+    <w:p>
+      <w:pPr>
+        <w:numPr>
+          <w:ilvl w:val="0"/>
+          <w:numId w:val="2"/>
+        </w:numPr>
+        <w:shd w:val="clear" w:color="auto" w:fill="FFFFFF"/>
+        <w:rPr>
+          <w:rFonts w:ascii="Times New Roman" w:eastAsia="Times New Roman" w:hAnsi="Times New Roman" w:cs="Times New Roman"/>
+        </w:rPr>
+      </w:pPr>
+      <w:r>
+        <w:rPr>
+          <w:rFonts w:ascii="Times New Roman" w:eastAsia="Times New Roman" w:hAnsi="Times New Roman" w:cs="Times New Roman"/>
+        </w:rPr>
+        <w:t xml:space="preserve">Improved upon the assessment (1.5 hours) </w:t>
+      </w:r>
+    </w:p>
+    <w:p>
+      <w:pPr>
+        <w:shd w:val="clear" w:color="auto" w:fill="FFFFFF"/>
+        <w:rPr>
+          <w:rFonts w:ascii="Times New Roman" w:eastAsia="Times New Roman" w:hAnsi="Times New Roman" w:cs="Times New Roman"/>
+        </w:rPr>
+      </w:pPr>
+    </w:p>
+    <w:p>
+      <w:pPr>
+        <w:shd w:val="clear" w:color="auto" w:fill="FFFFFF"/>
+        <w:rPr>
+          <w:rFonts w:ascii="Times New Roman" w:eastAsia="Times New Roman" w:hAnsi="Times New Roman" w:cs="Times New Roman"/>
+        </w:rPr>
+      </w:pPr>
+      <w:r>
+        <w:rPr>
+          <w:rFonts w:ascii="Times New Roman" w:eastAsia="Times New Roman" w:hAnsi="Times New Roman" w:cs="Times New Roman"/>
+        </w:rPr>
+        <w:t xml:space="preserve">Note: </w:t>
+      </w:r>
+      <w:r>
+        <w:rPr>
+          <w:rFonts w:ascii="Times New Roman" w:eastAsia="Times New Roman" w:hAnsi="Times New Roman" w:cs="Times New Roman"/>
+        </w:rPr>
+        <w:t>The main goal for this week (CMMC Dictionary) was accomplished. Secondary goals (report/assessment improvements) will continue to next week.</w:t>
+      </w:r>
     </w:p>
     <w:p>
       <w:pPr>
@@ -4243,6 +4803,72 @@
           <w:rFonts w:ascii="Times New Roman" w:eastAsia="Times New Roman" w:hAnsi="Times New Roman" w:cs="Times New Roman"/>
         </w:rPr>
       </w:pPr>
+      <w:r>
+        <w:rPr>
+          <w:rFonts w:ascii="Times New Roman" w:eastAsia="Times New Roman" w:hAnsi="Times New Roman" w:cs="Times New Roman"/>
+        </w:rPr>
+        <w:t>Additional website assessment implementation (</w:t>
+      </w:r>
+      <w:r>
+        <w:rPr>
+          <w:rFonts w:ascii="Times New Roman" w:eastAsia="Times New Roman" w:hAnsi="Times New Roman" w:cs="Times New Roman"/>
+        </w:rPr>
+        <w:t>4-6</w:t>
+      </w:r>
+      <w:r>
+        <w:rPr>
+          <w:rFonts w:ascii="Times New Roman" w:eastAsia="Times New Roman" w:hAnsi="Times New Roman" w:cs="Times New Roman"/>
+        </w:rPr>
+        <w:t xml:space="preserve"> hours)</w:t>
+      </w:r>
+    </w:p>
+    <w:p>
+      <w:pPr>
+        <w:numPr>
+          <w:ilvl w:val="0"/>
+          <w:numId w:val="1"/>
+        </w:numPr>
+        <w:shd w:val="clear" w:color="auto" w:fill="FFFFFF"/>
+        <w:rPr>
+          <w:rFonts w:ascii="Times New Roman" w:eastAsia="Times New Roman" w:hAnsi="Times New Roman" w:cs="Times New Roman"/>
+        </w:rPr>
+      </w:pPr>
+      <w:r>
+        <w:rPr>
+          <w:rFonts w:ascii="Times New Roman" w:eastAsia="Times New Roman" w:hAnsi="Times New Roman" w:cs="Times New Roman"/>
+        </w:rPr>
+        <w:t>Additional website report implementation (</w:t>
+      </w:r>
+      <w:r>
+        <w:rPr>
+          <w:rFonts w:ascii="Times New Roman" w:eastAsia="Times New Roman" w:hAnsi="Times New Roman" w:cs="Times New Roman"/>
+        </w:rPr>
+        <w:t>5-7</w:t>
+      </w:r>
+      <w:r>
+        <w:rPr>
+          <w:rFonts w:ascii="Times New Roman" w:eastAsia="Times New Roman" w:hAnsi="Times New Roman" w:cs="Times New Roman"/>
+        </w:rPr>
+        <w:t xml:space="preserve"> hours)</w:t>
+      </w:r>
+    </w:p>
+    <w:p>
+      <w:pPr>
+        <w:numPr>
+          <w:ilvl w:val="0"/>
+          <w:numId w:val="1"/>
+        </w:numPr>
+        <w:shd w:val="clear" w:color="auto" w:fill="FFFFFF"/>
+        <w:rPr>
+          <w:rFonts w:ascii="Times New Roman" w:eastAsia="Times New Roman" w:hAnsi="Times New Roman" w:cs="Times New Roman"/>
+        </w:rPr>
+      </w:pPr>
+      <w:r>
+        <w:rPr>
+          <w:rFonts w:ascii="Times New Roman" w:eastAsia="Times New Roman" w:hAnsi="Times New Roman" w:cs="Times New Roman"/>
+        </w:rPr>
+        <w:t>Additional fixes and style adjustments (2 hours)</w:t>
+      </w:r>
     </w:p>
     <w:p>
       <w:pPr>
@@ -4287,8 +4913,88 @@
           <w:rFonts w:ascii="Times New Roman" w:eastAsia="Times New Roman" w:hAnsi="Times New Roman" w:cs="Times New Roman"/>
           <w:b/>
         </w:rPr>
-        <w:t>3.) Any changes you have identified that will result in your final project being different than your project proposal. This information must be recorded in 3 ways</w:t>
-      </w:r>
+        <w:t xml:space="preserve">3.) Any changes you have </w:t>
+      </w:r>
+      <w:proofErr w:type="gramStart"/>
+      <w:r>
+        <w:rPr>
+          <w:rFonts w:ascii="Times New Roman" w:eastAsia="Times New Roman" w:hAnsi="Times New Roman" w:cs="Times New Roman"/>
+          <w:b/>
+        </w:rPr>
+        <w:t>identified that</w:t>
+      </w:r>
+      <w:proofErr w:type="gramEnd"/>
+      <w:r>
+        <w:rPr>
+          <w:rFonts w:ascii="Times New Roman" w:eastAsia="Times New Roman" w:hAnsi="Times New Roman" w:cs="Times New Roman"/>
+          <w:b/>
+        </w:rPr>
+        <w:t xml:space="preserve"> will result in your final project being different </w:t>
+      </w:r>
+      <w:proofErr w:type="gramStart"/>
+      <w:r>
+        <w:rPr>
+          <w:rFonts w:ascii="Times New Roman" w:eastAsia="Times New Roman" w:hAnsi="Times New Roman" w:cs="Times New Roman"/>
+          <w:b/>
+        </w:rPr>
+        <w:t>than</w:t>
+      </w:r>
+      <w:proofErr w:type="gramEnd"/>
+      <w:r>
+        <w:rPr>
+          <w:rFonts w:ascii="Times New Roman" w:eastAsia="Times New Roman" w:hAnsi="Times New Roman" w:cs="Times New Roman"/>
+          <w:b/>
+        </w:rPr>
+        <w:t xml:space="preserve"> your project proposal. This information must be recorded in 3 ways</w:t>
+      </w:r>
+    </w:p>
+    <w:p>
+      <w:pPr>
+        <w:shd w:val="clear" w:color="auto" w:fill="FFFFFF"/>
+        <w:rPr>
+          <w:rFonts w:ascii="Times New Roman" w:eastAsia="Times New Roman" w:hAnsi="Times New Roman" w:cs="Times New Roman"/>
+          <w:b/>
+        </w:rPr>
+      </w:pPr>
+    </w:p>
+    <w:p>
+      <w:pPr>
+        <w:shd w:val="clear" w:color="auto" w:fill="FFFFFF"/>
+        <w:rPr>
+          <w:rFonts w:ascii="Times New Roman" w:eastAsia="Times New Roman" w:hAnsi="Times New Roman" w:cs="Times New Roman"/>
+          <w:bCs/>
+        </w:rPr>
+      </w:pPr>
+      <w:r>
+        <w:rPr>
+          <w:rFonts w:ascii="Times New Roman" w:eastAsia="Times New Roman" w:hAnsi="Times New Roman" w:cs="Times New Roman"/>
+          <w:bCs/>
+        </w:rPr>
+        <w:t>No changes</w:t>
+      </w:r>
+      <w:r>
+        <w:rPr>
+          <w:rFonts w:ascii="Times New Roman" w:eastAsia="Times New Roman" w:hAnsi="Times New Roman" w:cs="Times New Roman"/>
+          <w:bCs/>
+        </w:rPr>
+        <w:t xml:space="preserve"> have been made</w:t>
+      </w:r>
+      <w:r>
+        <w:rPr>
+          <w:rFonts w:ascii="Times New Roman" w:eastAsia="Times New Roman" w:hAnsi="Times New Roman" w:cs="Times New Roman"/>
+          <w:bCs/>
+        </w:rPr>
+        <w:t xml:space="preserve"> to the current proposal (CMMCFledge_Proposal_V1.0.4.docx), October 16, 2025.</w:t>
+      </w:r>
+    </w:p>
+    <w:p>
+      <w:pPr>
+        <w:shd w:val="clear" w:color="auto" w:fill="FFFFFF"/>
+        <w:rPr>
+          <w:rFonts w:ascii="Times New Roman" w:eastAsia="Times New Roman" w:hAnsi="Times New Roman" w:cs="Times New Roman"/>
+          <w:b/>
+        </w:rPr>
+      </w:pPr>
     </w:p>
     <w:p>
       <w:pPr>
@@ -4315,7 +5021,13 @@
       <w:bookmarkStart w:id="12" w:name="_Toc211503552"/>
       <w:r>
         <w:lastRenderedPageBreak/>
-        <w:t>Week 9 (11/16/2025)</w:t>
+        <w:t>Week 9 (11/</w:t>
+      </w:r>
+      <w:r>
+        <w:t>25</w:t>
+      </w:r>
+      <w:r>
+        <w:t>/2025)</w:t>
       </w:r>
       <w:bookmarkEnd w:id="12"/>
     </w:p>
@@ -4332,7 +5044,23 @@
           <w:rFonts w:ascii="Times New Roman" w:eastAsia="Times New Roman" w:hAnsi="Times New Roman" w:cs="Times New Roman"/>
           <w:b/>
         </w:rPr>
-        <w:t>1.) What progress you made since the last meeting, including specific items that were completed, and the time spent on each item</w:t>
+        <w:t xml:space="preserve">1.) What progress </w:t>
+      </w:r>
+      <w:proofErr w:type="gramStart"/>
+      <w:r>
+        <w:rPr>
+          <w:rFonts w:ascii="Times New Roman" w:eastAsia="Times New Roman" w:hAnsi="Times New Roman" w:cs="Times New Roman"/>
+          <w:b/>
+        </w:rPr>
+        <w:t>you</w:t>
+      </w:r>
+      <w:proofErr w:type="gramEnd"/>
+      <w:r>
+        <w:rPr>
+          <w:rFonts w:ascii="Times New Roman" w:eastAsia="Times New Roman" w:hAnsi="Times New Roman" w:cs="Times New Roman"/>
+          <w:b/>
+        </w:rPr>
+        <w:t xml:space="preserve"> made since the last meeting, including specific items that were completed, and the time spent on each item</w:t>
       </w:r>
     </w:p>
     <w:p>
@@ -4478,7 +5206,39 @@
           <w:rFonts w:ascii="Times New Roman" w:eastAsia="Times New Roman" w:hAnsi="Times New Roman" w:cs="Times New Roman"/>
           <w:b/>
         </w:rPr>
-        <w:t>3.) Any changes you have identified that will result in your final project being different than your project proposal. This information must be recorded in 3 ways</w:t>
+        <w:t xml:space="preserve">3.) Any changes you have </w:t>
+      </w:r>
+      <w:proofErr w:type="gramStart"/>
+      <w:r>
+        <w:rPr>
+          <w:rFonts w:ascii="Times New Roman" w:eastAsia="Times New Roman" w:hAnsi="Times New Roman" w:cs="Times New Roman"/>
+          <w:b/>
+        </w:rPr>
+        <w:t>identified that</w:t>
+      </w:r>
+      <w:proofErr w:type="gramEnd"/>
+      <w:r>
+        <w:rPr>
+          <w:rFonts w:ascii="Times New Roman" w:eastAsia="Times New Roman" w:hAnsi="Times New Roman" w:cs="Times New Roman"/>
+          <w:b/>
+        </w:rPr>
+        <w:t xml:space="preserve"> will result in your final project being different </w:t>
+      </w:r>
+      <w:proofErr w:type="gramStart"/>
+      <w:r>
+        <w:rPr>
+          <w:rFonts w:ascii="Times New Roman" w:eastAsia="Times New Roman" w:hAnsi="Times New Roman" w:cs="Times New Roman"/>
+          <w:b/>
+        </w:rPr>
+        <w:t>than</w:t>
+      </w:r>
+      <w:proofErr w:type="gramEnd"/>
+      <w:r>
+        <w:rPr>
+          <w:rFonts w:ascii="Times New Roman" w:eastAsia="Times New Roman" w:hAnsi="Times New Roman" w:cs="Times New Roman"/>
+          <w:b/>
+        </w:rPr>
+        <w:t xml:space="preserve"> your project proposal. This information must be recorded in 3 ways</w:t>
       </w:r>
     </w:p>
     <w:p>
@@ -5569,7 +6329,6 @@
   <w:style w:type="character" w:default="1" w:styleId="DefaultParagraphFont">
     <w:name w:val="Default Paragraph Font"/>
     <w:uiPriority w:val="1"/>
-    <w:semiHidden/>
     <w:unhideWhenUsed/>
   </w:style>
   <w:style w:type="table" w:default="1" w:styleId="TableNormal">

</xml_diff>

<commit_message>
Week 9 standup added
</commit_message>
<xml_diff>
--- a/02_WorkingDocs/CMMCFledge_Standup_Log.docx
+++ b/02_WorkingDocs/CMMCFledge_Standup_Log.docx
@@ -4807,19 +4807,7 @@
         <w:rPr>
           <w:rFonts w:ascii="Times New Roman" w:eastAsia="Times New Roman" w:hAnsi="Times New Roman" w:cs="Times New Roman"/>
         </w:rPr>
-        <w:t>Additional website assessment implementation (</w:t>
-      </w:r>
-      <w:r>
-        <w:rPr>
-          <w:rFonts w:ascii="Times New Roman" w:eastAsia="Times New Roman" w:hAnsi="Times New Roman" w:cs="Times New Roman"/>
-        </w:rPr>
-        <w:t>4-6</w:t>
-      </w:r>
-      <w:r>
-        <w:rPr>
-          <w:rFonts w:ascii="Times New Roman" w:eastAsia="Times New Roman" w:hAnsi="Times New Roman" w:cs="Times New Roman"/>
-        </w:rPr>
-        <w:t xml:space="preserve"> hours)</w:t>
+        <w:t>Additional website assessment implementation (4-6 hours)</w:t>
       </w:r>
     </w:p>
     <w:p>
@@ -4837,19 +4825,7 @@
         <w:rPr>
           <w:rFonts w:ascii="Times New Roman" w:eastAsia="Times New Roman" w:hAnsi="Times New Roman" w:cs="Times New Roman"/>
         </w:rPr>
-        <w:t>Additional website report implementation (</w:t>
-      </w:r>
-      <w:r>
-        <w:rPr>
-          <w:rFonts w:ascii="Times New Roman" w:eastAsia="Times New Roman" w:hAnsi="Times New Roman" w:cs="Times New Roman"/>
-        </w:rPr>
-        <w:t>5-7</w:t>
-      </w:r>
-      <w:r>
-        <w:rPr>
-          <w:rFonts w:ascii="Times New Roman" w:eastAsia="Times New Roman" w:hAnsi="Times New Roman" w:cs="Times New Roman"/>
-        </w:rPr>
-        <w:t xml:space="preserve"> hours)</w:t>
+        <w:t>Additional website report implementation (5-7 hours)</w:t>
       </w:r>
     </w:p>
     <w:p>
@@ -5096,14 +5072,136 @@
           <w:rFonts w:ascii="Times New Roman" w:eastAsia="Times New Roman" w:hAnsi="Times New Roman" w:cs="Times New Roman"/>
         </w:rPr>
       </w:pPr>
-    </w:p>
-    <w:p>
-      <w:pPr>
-        <w:shd w:val="clear" w:color="auto" w:fill="FFFFFF"/>
-        <w:rPr>
-          <w:rFonts w:ascii="Times New Roman" w:eastAsia="Times New Roman" w:hAnsi="Times New Roman" w:cs="Times New Roman"/>
-        </w:rPr>
-      </w:pPr>
+      <w:r>
+        <w:rPr>
+          <w:rFonts w:ascii="Times New Roman" w:eastAsia="Times New Roman" w:hAnsi="Times New Roman" w:cs="Times New Roman"/>
+        </w:rPr>
+        <w:t>W</w:t>
+      </w:r>
+      <w:r>
+        <w:rPr>
+          <w:rFonts w:ascii="Times New Roman" w:eastAsia="Times New Roman" w:hAnsi="Times New Roman" w:cs="Times New Roman"/>
+        </w:rPr>
+        <w:t>ebsite assessment</w:t>
+      </w:r>
+      <w:r>
+        <w:rPr>
+          <w:rFonts w:ascii="Times New Roman" w:eastAsia="Times New Roman" w:hAnsi="Times New Roman" w:cs="Times New Roman"/>
+        </w:rPr>
+        <w:t>/report</w:t>
+      </w:r>
+      <w:r>
+        <w:rPr>
+          <w:rFonts w:ascii="Times New Roman" w:eastAsia="Times New Roman" w:hAnsi="Times New Roman" w:cs="Times New Roman"/>
+        </w:rPr>
+        <w:t xml:space="preserve"> </w:t>
+      </w:r>
+      <w:r>
+        <w:rPr>
+          <w:rFonts w:ascii="Times New Roman" w:eastAsia="Times New Roman" w:hAnsi="Times New Roman" w:cs="Times New Roman"/>
+        </w:rPr>
+        <w:t>write-ups</w:t>
+      </w:r>
+      <w:r>
+        <w:rPr>
+          <w:rFonts w:ascii="Times New Roman" w:eastAsia="Times New Roman" w:hAnsi="Times New Roman" w:cs="Times New Roman"/>
+        </w:rPr>
+        <w:t xml:space="preserve"> (</w:t>
+      </w:r>
+      <w:r>
+        <w:rPr>
+          <w:rFonts w:ascii="Times New Roman" w:eastAsia="Times New Roman" w:hAnsi="Times New Roman" w:cs="Times New Roman"/>
+        </w:rPr>
+        <w:t>10.5</w:t>
+      </w:r>
+      <w:r>
+        <w:rPr>
+          <w:rFonts w:ascii="Times New Roman" w:eastAsia="Times New Roman" w:hAnsi="Times New Roman" w:cs="Times New Roman"/>
+        </w:rPr>
+        <w:t xml:space="preserve"> </w:t>
+      </w:r>
+      <w:r>
+        <w:rPr>
+          <w:rFonts w:ascii="Times New Roman" w:eastAsia="Times New Roman" w:hAnsi="Times New Roman" w:cs="Times New Roman"/>
+        </w:rPr>
+        <w:t>hours)</w:t>
+      </w:r>
+    </w:p>
+    <w:p>
+      <w:pPr>
+        <w:numPr>
+          <w:ilvl w:val="0"/>
+          <w:numId w:val="2"/>
+        </w:numPr>
+        <w:shd w:val="clear" w:color="auto" w:fill="FFFFFF"/>
+        <w:rPr>
+          <w:rFonts w:ascii="Times New Roman" w:eastAsia="Times New Roman" w:hAnsi="Times New Roman" w:cs="Times New Roman"/>
+        </w:rPr>
+      </w:pPr>
+      <w:r>
+        <w:rPr>
+          <w:rFonts w:ascii="Times New Roman" w:eastAsia="Times New Roman" w:hAnsi="Times New Roman" w:cs="Times New Roman"/>
+        </w:rPr>
+        <w:t>Additional fixes and style adjustments (</w:t>
+      </w:r>
+      <w:r>
+        <w:rPr>
+          <w:rFonts w:ascii="Times New Roman" w:eastAsia="Times New Roman" w:hAnsi="Times New Roman" w:cs="Times New Roman"/>
+        </w:rPr>
+        <w:t xml:space="preserve">2.5 </w:t>
+      </w:r>
+      <w:r>
+        <w:rPr>
+          <w:rFonts w:ascii="Times New Roman" w:eastAsia="Times New Roman" w:hAnsi="Times New Roman" w:cs="Times New Roman"/>
+        </w:rPr>
+        <w:t>hours)</w:t>
+      </w:r>
+    </w:p>
+    <w:p>
+      <w:pPr>
+        <w:numPr>
+          <w:ilvl w:val="0"/>
+          <w:numId w:val="2"/>
+        </w:numPr>
+        <w:shd w:val="clear" w:color="auto" w:fill="FFFFFF"/>
+        <w:rPr>
+          <w:rFonts w:ascii="Times New Roman" w:eastAsia="Times New Roman" w:hAnsi="Times New Roman" w:cs="Times New Roman"/>
+        </w:rPr>
+      </w:pPr>
+      <w:r>
+        <w:rPr>
+          <w:rFonts w:ascii="Times New Roman" w:eastAsia="Times New Roman" w:hAnsi="Times New Roman" w:cs="Times New Roman"/>
+        </w:rPr>
+        <w:t>Preparing final deliverables (2 hours)</w:t>
+      </w:r>
+    </w:p>
+    <w:p>
+      <w:pPr>
+        <w:shd w:val="clear" w:color="auto" w:fill="FFFFFF"/>
+        <w:rPr>
+          <w:rFonts w:ascii="Times New Roman" w:eastAsia="Times New Roman" w:hAnsi="Times New Roman" w:cs="Times New Roman"/>
+        </w:rPr>
+      </w:pPr>
+    </w:p>
+    <w:p>
+      <w:pPr>
+        <w:shd w:val="clear" w:color="auto" w:fill="FFFFFF"/>
+        <w:rPr>
+          <w:rFonts w:ascii="Times New Roman" w:eastAsia="Times New Roman" w:hAnsi="Times New Roman" w:cs="Times New Roman"/>
+        </w:rPr>
+      </w:pPr>
+      <w:r>
+        <w:rPr>
+          <w:rFonts w:ascii="Times New Roman" w:eastAsia="Times New Roman" w:hAnsi="Times New Roman" w:cs="Times New Roman"/>
+        </w:rPr>
+        <w:t xml:space="preserve">Note: </w:t>
+      </w:r>
+      <w:r>
+        <w:rPr>
+          <w:rFonts w:ascii="Times New Roman" w:eastAsia="Times New Roman" w:hAnsi="Times New Roman" w:cs="Times New Roman"/>
+        </w:rPr>
+        <w:t>Goals from last week were combined into one entry due to connectedness. Hours were as estimated.</w:t>
+      </w:r>
     </w:p>
     <w:p>
       <w:pPr>
@@ -5162,6 +5260,90 @@
           <w:rFonts w:ascii="Times New Roman" w:eastAsia="Times New Roman" w:hAnsi="Times New Roman" w:cs="Times New Roman"/>
         </w:rPr>
       </w:pPr>
+      <w:r>
+        <w:rPr>
+          <w:rFonts w:ascii="Times New Roman" w:eastAsia="Times New Roman" w:hAnsi="Times New Roman" w:cs="Times New Roman"/>
+        </w:rPr>
+        <w:t>Finalizing</w:t>
+      </w:r>
+      <w:r>
+        <w:rPr>
+          <w:rFonts w:ascii="Times New Roman" w:eastAsia="Times New Roman" w:hAnsi="Times New Roman" w:cs="Times New Roman"/>
+        </w:rPr>
+        <w:t xml:space="preserve"> assessment/report implementation (4-6 hours)</w:t>
+      </w:r>
+    </w:p>
+    <w:p>
+      <w:pPr>
+        <w:numPr>
+          <w:ilvl w:val="0"/>
+          <w:numId w:val="1"/>
+        </w:numPr>
+        <w:shd w:val="clear" w:color="auto" w:fill="FFFFFF"/>
+        <w:rPr>
+          <w:rFonts w:ascii="Times New Roman" w:eastAsia="Times New Roman" w:hAnsi="Times New Roman" w:cs="Times New Roman"/>
+        </w:rPr>
+      </w:pPr>
+      <w:r>
+        <w:rPr>
+          <w:rFonts w:ascii="Times New Roman" w:eastAsia="Times New Roman" w:hAnsi="Times New Roman" w:cs="Times New Roman"/>
+        </w:rPr>
+        <w:t>Verifying full implementation</w:t>
+      </w:r>
+      <w:r>
+        <w:rPr>
+          <w:rFonts w:ascii="Times New Roman" w:eastAsia="Times New Roman" w:hAnsi="Times New Roman" w:cs="Times New Roman"/>
+        </w:rPr>
+        <w:t xml:space="preserve"> (</w:t>
+      </w:r>
+      <w:r>
+        <w:rPr>
+          <w:rFonts w:ascii="Times New Roman" w:eastAsia="Times New Roman" w:hAnsi="Times New Roman" w:cs="Times New Roman"/>
+        </w:rPr>
+        <w:t>3</w:t>
+      </w:r>
+      <w:r>
+        <w:rPr>
+          <w:rFonts w:ascii="Times New Roman" w:eastAsia="Times New Roman" w:hAnsi="Times New Roman" w:cs="Times New Roman"/>
+        </w:rPr>
+        <w:t xml:space="preserve"> hours)</w:t>
+      </w:r>
+    </w:p>
+    <w:p>
+      <w:pPr>
+        <w:numPr>
+          <w:ilvl w:val="0"/>
+          <w:numId w:val="1"/>
+        </w:numPr>
+        <w:shd w:val="clear" w:color="auto" w:fill="FFFFFF"/>
+        <w:rPr>
+          <w:rFonts w:ascii="Times New Roman" w:eastAsia="Times New Roman" w:hAnsi="Times New Roman" w:cs="Times New Roman"/>
+        </w:rPr>
+      </w:pPr>
+      <w:r>
+        <w:rPr>
+          <w:rFonts w:ascii="Times New Roman" w:eastAsia="Times New Roman" w:hAnsi="Times New Roman" w:cs="Times New Roman"/>
+        </w:rPr>
+        <w:t>Finalizing</w:t>
+      </w:r>
+      <w:r>
+        <w:rPr>
+          <w:rFonts w:ascii="Times New Roman" w:eastAsia="Times New Roman" w:hAnsi="Times New Roman" w:cs="Times New Roman"/>
+        </w:rPr>
+        <w:t xml:space="preserve"> deliverables (</w:t>
+      </w:r>
+      <w:r>
+        <w:rPr>
+          <w:rFonts w:ascii="Times New Roman" w:eastAsia="Times New Roman" w:hAnsi="Times New Roman" w:cs="Times New Roman"/>
+        </w:rPr>
+        <w:t>7</w:t>
+      </w:r>
+      <w:r>
+        <w:rPr>
+          <w:rFonts w:ascii="Times New Roman" w:eastAsia="Times New Roman" w:hAnsi="Times New Roman" w:cs="Times New Roman"/>
+        </w:rPr>
+        <w:t xml:space="preserve"> hours)</w:t>
+      </w:r>
     </w:p>
     <w:p>
       <w:pPr>
@@ -5247,6 +5429,36 @@
           <w:rFonts w:ascii="Times New Roman" w:eastAsia="Times New Roman" w:hAnsi="Times New Roman" w:cs="Times New Roman"/>
         </w:rPr>
       </w:pPr>
+    </w:p>
+    <w:p>
+      <w:pPr>
+        <w:shd w:val="clear" w:color="auto" w:fill="FFFFFF"/>
+        <w:rPr>
+          <w:rFonts w:ascii="Times New Roman" w:eastAsia="Times New Roman" w:hAnsi="Times New Roman" w:cs="Times New Roman"/>
+          <w:bCs/>
+        </w:rPr>
+      </w:pPr>
+      <w:r>
+        <w:rPr>
+          <w:rFonts w:ascii="Times New Roman" w:eastAsia="Times New Roman" w:hAnsi="Times New Roman" w:cs="Times New Roman"/>
+          <w:bCs/>
+        </w:rPr>
+        <w:t>No changes</w:t>
+      </w:r>
+      <w:r>
+        <w:rPr>
+          <w:rFonts w:ascii="Times New Roman" w:eastAsia="Times New Roman" w:hAnsi="Times New Roman" w:cs="Times New Roman"/>
+          <w:bCs/>
+        </w:rPr>
+        <w:t xml:space="preserve"> have been made</w:t>
+      </w:r>
+      <w:r>
+        <w:rPr>
+          <w:rFonts w:ascii="Times New Roman" w:eastAsia="Times New Roman" w:hAnsi="Times New Roman" w:cs="Times New Roman"/>
+          <w:bCs/>
+        </w:rPr>
+        <w:t xml:space="preserve"> to the current proposal (CMMCFledge_Proposal_V1.0.4.docx), October 16, 2025.</w:t>
+      </w:r>
     </w:p>
     <w:p>
       <w:pPr>
@@ -6329,6 +6541,7 @@
   <w:style w:type="character" w:default="1" w:styleId="DefaultParagraphFont">
     <w:name w:val="Default Paragraph Font"/>
     <w:uiPriority w:val="1"/>
+    <w:semiHidden/>
     <w:unhideWhenUsed/>
   </w:style>
   <w:style w:type="table" w:default="1" w:styleId="TableNormal">

</xml_diff>